<commit_message>
Restored Original Preview 7 client template
</commit_message>
<xml_diff>
--- a/Evidence/TestReport.docx
+++ b/Evidence/TestReport.docx
@@ -5440,7 +5440,7 @@
               <w:t xml:space="preserve"> </w:t>
             </w:r>
             <w:r>
-              <w:t>Works Properly</w:t>
+              <w:t>Failed</w:t>
             </w:r>
           </w:p>
         </w:tc>
@@ -5463,7 +5463,7 @@
           </w:tcPr>
           <w:p>
             <w:r>
-              <w:t>Creation reports Cancelled promptly, status remains No client, and no abandoned worker remains. A later normal creation and Fast invocation succeed.</w:t>
+              <w:t>Creation returns Cancelled and UI shows No client, but worker count remains 1 after cancellation.</w:t>
             </w:r>
           </w:p>
         </w:tc>
@@ -5554,7 +5554,7 @@
               <w:t xml:space="preserve">: </w:t>
             </w:r>
             <w:r>
-              <w:t>Works Properly</w:t>
+              <w:t>Failed</w:t>
             </w:r>
           </w:p>
         </w:tc>
@@ -5678,7 +5678,7 @@
               <w:t xml:space="preserve"> </w:t>
             </w:r>
             <w:r>
-              <w:t>Works Properly</w:t>
+              <w:t>Failed</w:t>
             </w:r>
           </w:p>
         </w:tc>
@@ -5805,7 +5805,7 @@
               <w:t xml:space="preserve"> </w:t>
             </w:r>
             <w:r>
-              <w:t>Works Properly</w:t>
+              <w:t>Failed</w:t>
             </w:r>
           </w:p>
         </w:tc>
@@ -10712,7 +10712,7 @@
               <w:t xml:space="preserve"> </w:t>
             </w:r>
             <w:r>
-              <w:t>Works Properly</w:t>
+              <w:t>Failed</w:t>
             </w:r>
           </w:p>
         </w:tc>
@@ -10744,7 +10744,7 @@
               <w:rPr>
                 <w:rFonts w:cs="Calibri"/>
               </w:rPr>
-              <w:t>Concurrent timeout B reports </w:t>
+              <w:t xml:space="preserve">A: Returned, B: </w:t>
             </w:r>
             <w:proofErr w:type="spellStart"/>
             <w:r>
@@ -10758,7 +10758,21 @@
               <w:rPr>
                 <w:rFonts w:cs="Calibri"/>
               </w:rPr>
-              <w:t>; A and C report Returned. Fast also returns. Any peer timeout, missing peer result, or hang is a product failure.</w:t>
+              <w:t xml:space="preserve">, C: </w:t>
+            </w:r>
+            <w:proofErr w:type="spellStart"/>
+            <w:r>
+              <w:rPr>
+                <w:rFonts w:cs="Calibri"/>
+              </w:rPr>
+              <w:t>TimedOut</w:t>
+            </w:r>
+            <w:proofErr w:type="spellEnd"/>
+            <w:r>
+              <w:rPr>
+                <w:rFonts w:cs="Calibri"/>
+              </w:rPr>
+              <w:t>. The assertion reports Failed.</w:t>
             </w:r>
           </w:p>
         </w:tc>
@@ -10872,7 +10886,7 @@
               <w:t xml:space="preserve">: </w:t>
             </w:r>
             <w:r>
-              <w:t>Works Properly</w:t>
+              <w:t>Failed</w:t>
             </w:r>
           </w:p>
         </w:tc>
@@ -11025,7 +11039,7 @@
               <w:t xml:space="preserve"> </w:t>
             </w:r>
             <w:r>
-              <w:t>Works Properly</w:t>
+              <w:t>Failed</w:t>
             </w:r>
           </w:p>
         </w:tc>
@@ -11175,21 +11189,13 @@
                 <w:b/>
                 <w:bCs/>
               </w:rPr>
-              <w:t>P</w:t>
-            </w:r>
-            <w:r>
-              <w:rPr>
-                <w:b/>
-                <w:bCs/>
-              </w:rPr>
-              <w:lastRenderedPageBreak/>
-              <w:t>ublished):</w:t>
+              <w:t>Published):</w:t>
             </w:r>
             <w:r>
               <w:t xml:space="preserve"> </w:t>
             </w:r>
             <w:r>
-              <w:t>Works Properly</w:t>
+              <w:t>Failed</w:t>
             </w:r>
           </w:p>
         </w:tc>
@@ -11243,6 +11249,7 @@
               <w:rPr>
                 <w:rFonts w:cs="Calibri"/>
               </w:rPr>
+              <w:lastRenderedPageBreak/>
               <w:t>TC-19</w:t>
             </w:r>
           </w:p>
@@ -12012,14 +12019,7 @@
               <w:rPr>
                 <w:rFonts w:cs="Calibri"/>
               </w:rPr>
-              <w:t>Verify component teardown cleans up a worker when the user navigat</w:t>
-            </w:r>
-            <w:r>
-              <w:rPr>
-                <w:rFonts w:cs="Calibri"/>
-              </w:rPr>
-              <w:lastRenderedPageBreak/>
-              <w:t>es away.</w:t>
+              <w:t>Verify component teardown cleans up a worker when the user navigates away.</w:t>
             </w:r>
           </w:p>
         </w:tc>
@@ -12051,7 +12051,6 @@
               <w:rPr>
                 <w:rFonts w:asciiTheme="minorHAnsi" w:hAnsiTheme="minorHAnsi" w:cs="Calibri"/>
               </w:rPr>
-              <w:lastRenderedPageBreak/>
               <w:t>1. Create a client.</w:t>
             </w:r>
           </w:p>
@@ -12657,6 +12656,7 @@
               <w:rPr>
                 <w:rFonts w:cs="Calibri"/>
               </w:rPr>
+              <w:lastRenderedPageBreak/>
               <w:t>TC-21</w:t>
             </w:r>
           </w:p>
@@ -13526,67 +13526,33 @@
               <w:rPr>
                 <w:rFonts w:cs="Calibri"/>
               </w:rPr>
-              <w:t xml:space="preserve">TC-22 is an aggregate comparison of the configuration-specific recordings and is not a separately executed scenario. Its evidence consists of TC-01 through TC-21 </w:t>
+              <w:t>TC-22 is an aggregate comparison of the configuration-specific recordings and is not a separately executed scenario. Its evidence consists of TC-01 through TC-21 under InteractiveWebAssembly, StandaloneWebAssembly, PublishedInteractiveWASM, and </w:t>
+            </w:r>
+            <w:proofErr w:type="spellStart"/>
+            <w:r>
+              <w:rPr>
+                <w:rFonts w:cs="Calibri"/>
+              </w:rPr>
+              <w:t>PublishedOutputStandalone</w:t>
+            </w:r>
+            <w:proofErr w:type="spellEnd"/>
+            <w:r>
+              <w:rPr>
+                <w:rFonts w:cs="Calibri"/>
+              </w:rPr>
+              <w:t>.</w:t>
+            </w:r>
+            <w:r>
+              <w:rPr>
+                <w:rFonts w:cs="Calibri"/>
+              </w:rPr>
+              <w:br/>
             </w:r>
             <w:r>
               <w:rPr>
                 <w:rFonts w:cs="Calibri"/>
               </w:rPr>
               <w:lastRenderedPageBreak/>
-              <w:t>under InteractiveWebAssembly, </w:t>
-            </w:r>
-            <w:proofErr w:type="spellStart"/>
-            <w:r>
-              <w:rPr>
-                <w:rFonts w:cs="Calibri"/>
-              </w:rPr>
-              <w:t>StandaloneWebAssembly</w:t>
-            </w:r>
-            <w:proofErr w:type="spellEnd"/>
-            <w:r>
-              <w:rPr>
-                <w:rFonts w:cs="Calibri"/>
-              </w:rPr>
-              <w:t>, </w:t>
-            </w:r>
-            <w:proofErr w:type="spellStart"/>
-            <w:r>
-              <w:rPr>
-                <w:rFonts w:cs="Calibri"/>
-              </w:rPr>
-              <w:t>PublishedInteractiveWASM</w:t>
-            </w:r>
-            <w:proofErr w:type="spellEnd"/>
-            <w:r>
-              <w:rPr>
-                <w:rFonts w:cs="Calibri"/>
-              </w:rPr>
-              <w:t>, and </w:t>
-            </w:r>
-            <w:proofErr w:type="spellStart"/>
-            <w:r>
-              <w:rPr>
-                <w:rFonts w:cs="Calibri"/>
-              </w:rPr>
-              <w:t>PublishedOutputStandalone</w:t>
-            </w:r>
-            <w:proofErr w:type="spellEnd"/>
-            <w:r>
-              <w:rPr>
-                <w:rFonts w:cs="Calibri"/>
-              </w:rPr>
-              <w:t>.</w:t>
-            </w:r>
-            <w:r>
-              <w:rPr>
-                <w:rFonts w:cs="Calibri"/>
-              </w:rPr>
-              <w:br/>
-            </w:r>
-            <w:r>
-              <w:rPr>
-                <w:rFonts w:cs="Calibri"/>
-              </w:rPr>
               <w:br/>
             </w:r>
           </w:p>
@@ -14827,7 +14793,6 @@
               <w:rPr>
                 <w:rFonts w:cs="Calibri"/>
               </w:rPr>
-              <w:lastRenderedPageBreak/>
               <w:t>Disposal settles pending invocation</w:t>
             </w:r>
           </w:p>
@@ -15914,7 +15879,6 @@
           <w:b/>
           <w:bCs/>
         </w:rPr>
-        <w:lastRenderedPageBreak/>
         <w:t xml:space="preserve">Standalone </w:t>
       </w:r>
       <w:proofErr w:type="spellStart"/>
@@ -15948,6 +15912,7 @@
           <w:bCs/>
           <w:noProof/>
         </w:rPr>
+        <w:lastRenderedPageBreak/>
         <w:drawing>
           <wp:inline distT="0" distB="0" distL="0" distR="0" wp14:anchorId="6C3F396C" wp14:editId="62FAE8DB">
             <wp:extent cx="5943600" cy="2822575"/>
@@ -16107,7 +16072,6 @@
           <w:b/>
           <w:bCs/>
         </w:rPr>
-        <w:lastRenderedPageBreak/>
         <w:t xml:space="preserve">Standalone </w:t>
       </w:r>
       <w:proofErr w:type="spellStart"/>
@@ -16149,6 +16113,7 @@
           <w:bCs/>
           <w:noProof/>
         </w:rPr>
+        <w:lastRenderedPageBreak/>
         <w:drawing>
           <wp:inline distT="0" distB="0" distL="0" distR="0" wp14:anchorId="745A3EDA" wp14:editId="45540EFD">
             <wp:extent cx="5943600" cy="4425950"/>
@@ -16237,6 +16202,305 @@
         <w:t xml:space="preserve"> captured the console while testing for all the configurations.</w:t>
       </w:r>
     </w:p>
+    <w:p/>
+    <w:p>
+      <w:pPr>
+        <w:rPr>
+          <w:b/>
+          <w:bCs/>
+        </w:rPr>
+      </w:pPr>
+      <w:r>
+        <w:rPr>
+          <w:b/>
+          <w:bCs/>
+        </w:rPr>
+        <w:t>Problems:</w:t>
+      </w:r>
+    </w:p>
+    <w:tbl>
+      <w:tblPr>
+        <w:tblW w:w="0" w:type="auto"/>
+        <w:tblCellSpacing w:w="15" w:type="dxa"/>
+        <w:tblBorders>
+          <w:top w:val="single" w:sz="4" w:space="0" w:color="auto"/>
+          <w:left w:val="single" w:sz="4" w:space="0" w:color="auto"/>
+          <w:bottom w:val="single" w:sz="4" w:space="0" w:color="auto"/>
+          <w:right w:val="single" w:sz="4" w:space="0" w:color="auto"/>
+          <w:insideH w:val="single" w:sz="4" w:space="0" w:color="auto"/>
+          <w:insideV w:val="single" w:sz="4" w:space="0" w:color="auto"/>
+        </w:tblBorders>
+        <w:tblCellMar>
+          <w:top w:w="15" w:type="dxa"/>
+          <w:left w:w="15" w:type="dxa"/>
+          <w:bottom w:w="15" w:type="dxa"/>
+          <w:right w:w="15" w:type="dxa"/>
+        </w:tblCellMar>
+        <w:tblLook w:val="04A0" w:firstRow="1" w:lastRow="0" w:firstColumn="1" w:lastColumn="0" w:noHBand="0" w:noVBand="1"/>
+      </w:tblPr>
+      <w:tblGrid>
+        <w:gridCol w:w="1595"/>
+        <w:gridCol w:w="2022"/>
+        <w:gridCol w:w="2261"/>
+        <w:gridCol w:w="3472"/>
+      </w:tblGrid>
+      <w:tr>
+        <w:trPr>
+          <w:tblHeader/>
+          <w:tblCellSpacing w:w="15" w:type="dxa"/>
+        </w:trPr>
+        <w:tc>
+          <w:tcPr>
+            <w:tcW w:w="0" w:type="auto"/>
+            <w:vAlign w:val="center"/>
+            <w:hideMark/>
+          </w:tcPr>
+          <w:p>
+            <w:pPr>
+              <w:rPr>
+                <w:b/>
+                <w:bCs/>
+              </w:rPr>
+            </w:pPr>
+            <w:r>
+              <w:rPr>
+                <w:b/>
+                <w:bCs/>
+              </w:rPr>
+              <w:t>Test case</w:t>
+            </w:r>
+          </w:p>
+        </w:tc>
+        <w:tc>
+          <w:tcPr>
+            <w:tcW w:w="0" w:type="auto"/>
+            <w:vAlign w:val="center"/>
+            <w:hideMark/>
+          </w:tcPr>
+          <w:p>
+            <w:pPr>
+              <w:rPr>
+                <w:b/>
+                <w:bCs/>
+              </w:rPr>
+            </w:pPr>
+            <w:r>
+              <w:rPr>
+                <w:b/>
+                <w:bCs/>
+              </w:rPr>
+              <w:t>Expected output</w:t>
+            </w:r>
+          </w:p>
+        </w:tc>
+        <w:tc>
+          <w:tcPr>
+            <w:tcW w:w="0" w:type="auto"/>
+            <w:vAlign w:val="center"/>
+            <w:hideMark/>
+          </w:tcPr>
+          <w:p>
+            <w:pPr>
+              <w:rPr>
+                <w:b/>
+                <w:bCs/>
+              </w:rPr>
+            </w:pPr>
+            <w:r>
+              <w:rPr>
+                <w:b/>
+                <w:bCs/>
+              </w:rPr>
+              <w:t>Actual output with original Preview 7 client</w:t>
+            </w:r>
+          </w:p>
+        </w:tc>
+        <w:tc>
+          <w:tcPr>
+            <w:tcW w:w="0" w:type="auto"/>
+            <w:vAlign w:val="center"/>
+            <w:hideMark/>
+          </w:tcPr>
+          <w:p>
+            <w:pPr>
+              <w:rPr>
+                <w:b/>
+                <w:bCs/>
+              </w:rPr>
+            </w:pPr>
+            <w:r>
+              <w:rPr>
+                <w:b/>
+                <w:bCs/>
+              </w:rPr>
+              <w:t>Failure</w:t>
+            </w:r>
+          </w:p>
+        </w:tc>
+      </w:tr>
+      <w:tr>
+        <w:trPr>
+          <w:tblCellSpacing w:w="15" w:type="dxa"/>
+        </w:trPr>
+        <w:tc>
+          <w:tcPr>
+            <w:tcW w:w="0" w:type="auto"/>
+            <w:vAlign w:val="center"/>
+            <w:hideMark/>
+          </w:tcPr>
+          <w:p>
+            <w:r>
+              <w:rPr>
+                <w:b/>
+                <w:bCs/>
+              </w:rPr>
+              <w:t>TC-09: Cancel worker creation</w:t>
+            </w:r>
+          </w:p>
+        </w:tc>
+        <w:tc>
+          <w:tcPr>
+            <w:tcW w:w="0" w:type="auto"/>
+            <w:vAlign w:val="center"/>
+            <w:hideMark/>
+          </w:tcPr>
+          <w:p>
+            <w:r>
+              <w:t xml:space="preserve">Creation returns Cancelled, UI shows No client, and worker count </w:t>
+            </w:r>
+            <w:r>
+              <w:lastRenderedPageBreak/>
+              <w:t>returns from 1 to baseline 0.</w:t>
+            </w:r>
+          </w:p>
+        </w:tc>
+        <w:tc>
+          <w:tcPr>
+            <w:tcW w:w="0" w:type="auto"/>
+            <w:vAlign w:val="center"/>
+            <w:hideMark/>
+          </w:tcPr>
+          <w:p>
+            <w:r>
+              <w:lastRenderedPageBreak/>
+              <w:t xml:space="preserve">Creation returns Cancelled and UI shows No client, but worker count </w:t>
+            </w:r>
+            <w:r>
+              <w:lastRenderedPageBreak/>
+              <w:t>remains 1 after cancellation.</w:t>
+            </w:r>
+          </w:p>
+        </w:tc>
+        <w:tc>
+          <w:tcPr>
+            <w:tcW w:w="0" w:type="auto"/>
+            <w:vAlign w:val="center"/>
+            <w:hideMark/>
+          </w:tcPr>
+          <w:p>
+            <w:r>
+              <w:lastRenderedPageBreak/>
+              <w:t xml:space="preserve">The managed wait is cancelled, but the JavaScript worker continues initializing. Because no </w:t>
+            </w:r>
+            <w:proofErr w:type="spellStart"/>
+            <w:r>
+              <w:t>WebWorkerClient</w:t>
+            </w:r>
+            <w:proofErr w:type="spellEnd"/>
+            <w:r>
+              <w:t xml:space="preserve"> is returned, </w:t>
+            </w:r>
+            <w:r>
+              <w:lastRenderedPageBreak/>
+              <w:t>the application cannot terminate the orphaned worker.</w:t>
+            </w:r>
+          </w:p>
+        </w:tc>
+      </w:tr>
+      <w:tr>
+        <w:trPr>
+          <w:tblCellSpacing w:w="15" w:type="dxa"/>
+        </w:trPr>
+        <w:tc>
+          <w:tcPr>
+            <w:tcW w:w="0" w:type="auto"/>
+            <w:vAlign w:val="center"/>
+            <w:hideMark/>
+          </w:tcPr>
+          <w:p>
+            <w:r>
+              <w:rPr>
+                <w:b/>
+                <w:bCs/>
+              </w:rPr>
+              <w:lastRenderedPageBreak/>
+              <w:t>TC-18: Concurrent timeout isolation</w:t>
+            </w:r>
+          </w:p>
+        </w:tc>
+        <w:tc>
+          <w:tcPr>
+            <w:tcW w:w="0" w:type="auto"/>
+            <w:vAlign w:val="center"/>
+            <w:hideMark/>
+          </w:tcPr>
+          <w:p>
+            <w:r>
+              <w:t xml:space="preserve">A: Returned, B: </w:t>
+            </w:r>
+            <w:proofErr w:type="spellStart"/>
+            <w:r>
+              <w:t>TimedOut</w:t>
+            </w:r>
+            <w:proofErr w:type="spellEnd"/>
+            <w:r>
+              <w:t>, C: Returned. The assertion should pass.</w:t>
+            </w:r>
+          </w:p>
+        </w:tc>
+        <w:tc>
+          <w:tcPr>
+            <w:tcW w:w="0" w:type="auto"/>
+            <w:vAlign w:val="center"/>
+            <w:hideMark/>
+          </w:tcPr>
+          <w:p>
+            <w:r>
+              <w:t xml:space="preserve">A: Returned, B: </w:t>
+            </w:r>
+            <w:proofErr w:type="spellStart"/>
+            <w:r>
+              <w:t>TimedOut</w:t>
+            </w:r>
+            <w:proofErr w:type="spellEnd"/>
+            <w:r>
+              <w:t xml:space="preserve">, C: </w:t>
+            </w:r>
+            <w:proofErr w:type="spellStart"/>
+            <w:r>
+              <w:t>TimedOut</w:t>
+            </w:r>
+            <w:proofErr w:type="spellEnd"/>
+            <w:r>
+              <w:t>. The assertion reports Failed.</w:t>
+            </w:r>
+          </w:p>
+        </w:tc>
+        <w:tc>
+          <w:tcPr>
+            <w:tcW w:w="0" w:type="auto"/>
+            <w:vAlign w:val="center"/>
+            <w:hideMark/>
+          </w:tcPr>
+          <w:p>
+            <w:r>
+              <w:t>When B times out, the timeout handler deletes the callback for the latest request, C, instead of B. C’s response is then ignored, and C eventually reaches its own timeout.</w:t>
+            </w:r>
+          </w:p>
+        </w:tc>
+      </w:tr>
+    </w:tbl>
+    <w:p/>
     <w:sectPr>
       <w:pgSz w:w="12240" w:h="15840"/>
       <w:pgMar w:top="1440" w:right="1440" w:bottom="1440" w:left="1440" w:header="720" w:footer="720" w:gutter="0"/>
@@ -19255,7 +19519,6 @@
   <w:style w:type="character" w:default="1" w:styleId="DefaultParagraphFont">
     <w:name w:val="Default Paragraph Font"/>
     <w:uiPriority w:val="1"/>
-    <w:semiHidden/>
     <w:unhideWhenUsed/>
   </w:style>
   <w:style w:type="table" w:default="1" w:styleId="TableNormal">

</xml_diff>